<commit_message>
Publish four reports with authentic execution screenshots and final verification
</commit_message>
<xml_diff>
--- a/01_Data_Vault/Надточиев_АФ_223-322_Data_Vault.docx
+++ b/01_Data_Vault/Надточиев_АФ_223-322_Data_Vault.docx
@@ -44,7 +44,7 @@
     </w:p>
     <w:p>
       <w:r>
-        <w:t>Предметная область соответствует теме варианта 2 из списка вариантов: выполнение практической работы по дисциплине «СУБД». Назначенный вариант и готовая модель предыдущей работы отсутствовали; для реализации выбрана указанная учебная тема. Источник данных — условная LMS. Все примеры записей вымышлены.</w:t>
+        <w:t>Предметная область соответствует теме варианта 15: учёт проката на лыжной базе. Реализован контур клиентов, договоров проката и физических экземпляров инвентаря. Источник — условная система проката SKI_RENTAL. Все примеры записей вымышлены.</w:t>
       </w:r>
     </w:p>
     <w:p>
@@ -136,7 +136,7 @@
                 <w:b w:val="0"/>
                 <w:sz w:val="20"/>
               </w:rPr>
-              <w:t>Студент</w:t>
+              <w:t>Клиент</w:t>
             </w:r>
           </w:p>
         </w:tc>
@@ -153,7 +153,7 @@
                 <w:b w:val="0"/>
                 <w:sz w:val="20"/>
               </w:rPr>
-              <w:t>student_code</w:t>
+              <w:t>client_code</w:t>
             </w:r>
           </w:p>
         </w:tc>
@@ -170,7 +170,7 @@
                 <w:b w:val="0"/>
                 <w:sz w:val="20"/>
               </w:rPr>
-              <w:t>Номер учебной записи ST-001</w:t>
+              <w:t>Устойчивый код клиента CL-001</w:t>
             </w:r>
           </w:p>
         </w:tc>
@@ -189,7 +189,7 @@
                 <w:b w:val="0"/>
                 <w:sz w:val="20"/>
               </w:rPr>
-              <w:t>Дисциплина</w:t>
+              <w:t>Договор проката</w:t>
             </w:r>
           </w:p>
         </w:tc>
@@ -206,7 +206,7 @@
                 <w:b w:val="0"/>
                 <w:sz w:val="20"/>
               </w:rPr>
-              <w:t>course_code</w:t>
+              <w:t>rental_number</w:t>
             </w:r>
           </w:p>
         </w:tc>
@@ -223,7 +223,7 @@
                 <w:b w:val="0"/>
                 <w:sz w:val="20"/>
               </w:rPr>
-              <w:t>Код дисциплины DB</w:t>
+              <w:t>Номер договора RENT-001</w:t>
             </w:r>
           </w:p>
         </w:tc>
@@ -242,7 +242,7 @@
                 <w:b w:val="0"/>
                 <w:sz w:val="20"/>
               </w:rPr>
-              <w:t>Практическая работа</w:t>
+              <w:t>Экземпляр инвентаря</w:t>
             </w:r>
           </w:p>
         </w:tc>
@@ -259,7 +259,7 @@
                 <w:b w:val="0"/>
                 <w:sz w:val="20"/>
               </w:rPr>
-              <w:t>task_code</w:t>
+              <w:t>serial_number</w:t>
             </w:r>
           </w:p>
         </w:tc>
@@ -276,7 +276,7 @@
                 <w:b w:val="0"/>
                 <w:sz w:val="20"/>
               </w:rPr>
-              <w:t>Глобально уникальный код DB-PR01</w:t>
+              <w:t>Серийный номер NAD-SN-101</w:t>
             </w:r>
           </w:p>
         </w:tc>
@@ -295,7 +295,7 @@
                 <w:b w:val="0"/>
                 <w:sz w:val="20"/>
               </w:rPr>
-              <w:t>Сдача работы</w:t>
+              <w:t>Позиция договора</w:t>
             </w:r>
           </w:p>
         </w:tc>
@@ -329,7 +329,7 @@
                 <w:b w:val="0"/>
                 <w:sz w:val="20"/>
               </w:rPr>
-              <w:t>Студент + дисциплина + работа</w:t>
+              <w:t>Клиент + договор + экземпляр</w:t>
             </w:r>
           </w:p>
         </w:tc>
@@ -337,7 +337,7 @@
     </w:tbl>
     <w:p>
       <w:r>
-        <w:t>Коды уникальны, неизменны и трактуются с учётом регистра. Названия, группа студента, статус и оценка не входят в бизнес-ключи. Одна связь представляет сдачу работы; отдельные повторные попытки не моделируются.</w:t>
+        <w:t>Коды уникальны, неизменны и трактуются с учётом регистра. Имена клиентов, сегменты, названия инвентаря, статус и количество не входят в бизнес-ключи. Одна связь представляет позицию договора проката. Модель включает один источник и не моделирует продление договора отдельной сущностью.</w:t>
       </w:r>
     </w:p>
     <w:p>
@@ -362,7 +362,7 @@
       <w:r>
         <w:drawing>
           <wp:inline xmlns:a="http://schemas.openxmlformats.org/drawingml/2006/main" xmlns:pic="http://schemas.openxmlformats.org/drawingml/2006/picture">
-            <wp:extent cx="5940000" cy="4158000"/>
+            <wp:extent cx="5940000" cy="4306500"/>
             <wp:docPr id="1" name="Picture 1"/>
             <wp:cNvGraphicFramePr>
               <a:graphicFrameLocks noChangeAspect="1"/>
@@ -383,7 +383,7 @@
                   <pic:spPr>
                     <a:xfrm>
                       <a:off x="0" y="0"/>
-                      <a:ext cx="5940000" cy="4158000"/>
+                      <a:ext cx="5940000" cy="4306500"/>
                     </a:xfrm>
                     <a:prstGeom prst="rect"/>
                   </pic:spPr>
@@ -462,7 +462,7 @@
                 <w:b w:val="0"/>
                 <w:sz w:val="20"/>
               </w:rPr>
-              <w:t>sat_student_lms</w:t>
+              <w:t>sat_client</w:t>
             </w:r>
           </w:p>
         </w:tc>
@@ -479,7 +479,7 @@
                 <w:b w:val="0"/>
                 <w:sz w:val="20"/>
               </w:rPr>
-              <w:t>student_name, group_code</w:t>
+              <w:t>client_name, client_segment</w:t>
             </w:r>
           </w:p>
         </w:tc>
@@ -498,7 +498,7 @@
                 <w:b w:val="0"/>
                 <w:sz w:val="20"/>
               </w:rPr>
-              <w:t>sat_course_lms</w:t>
+              <w:t>sat_rental</w:t>
             </w:r>
           </w:p>
         </w:tc>
@@ -515,7 +515,7 @@
                 <w:b w:val="0"/>
                 <w:sz w:val="20"/>
               </w:rPr>
-              <w:t>course_name</w:t>
+              <w:t>rental_description</w:t>
             </w:r>
           </w:p>
         </w:tc>
@@ -534,7 +534,7 @@
                 <w:b w:val="0"/>
                 <w:sz w:val="20"/>
               </w:rPr>
-              <w:t>sat_task_lms</w:t>
+              <w:t>sat_equipment</w:t>
             </w:r>
           </w:p>
         </w:tc>
@@ -551,7 +551,7 @@
                 <w:b w:val="0"/>
                 <w:sz w:val="20"/>
               </w:rPr>
-              <w:t>task_name, deadline</w:t>
+              <w:t>equipment_name, purchase_date</w:t>
             </w:r>
           </w:p>
         </w:tc>
@@ -570,7 +570,7 @@
                 <w:b w:val="0"/>
                 <w:sz w:val="20"/>
               </w:rPr>
-              <w:t>sat_submission_lms</w:t>
+              <w:t>sat_rental_item</w:t>
             </w:r>
           </w:p>
         </w:tc>
@@ -587,7 +587,7 @@
                 <w:b w:val="0"/>
                 <w:sz w:val="20"/>
               </w:rPr>
-              <w:t>status, grade, submitted_at</w:t>
+              <w:t>status, quantity, returned_at</w:t>
             </w:r>
           </w:p>
         </w:tc>
@@ -613,7 +613,7 @@
     </w:p>
     <w:p>
       <w:r>
-        <w:t>Схема создаётся файлом 01_schema.sql. Данные и проверки находятся в 02_data_and_checks.sql. Оба файла входят в приложение к отчёту и опубликованы в репозитории.</w:t>
+        <w:t>Схема создаётся файлом 01_schema.sql. Данные и проверки находятся в 02_data_and_checks.sql. Оба файла опубликованы в репозитории; ссылка приведена в источниках.</w:t>
       </w:r>
     </w:p>
     <w:p>
@@ -629,7 +629,7 @@
         <w:br/>
         <w:t>RETURNS text LANGUAGE sql IMMUTABLE STRICT AS $$</w:t>
         <w:br/>
-        <w:t xml:space="preserve"> SELECT encode(digest(array_to_json(parts)::text,</w:t>
+        <w:t xml:space="preserve"> SELECT encode(public.digest(array_to_json(parts)::text,</w:t>
         <w:br/>
         <w:t xml:space="preserve">                     'sha256'), 'hex')</w:t>
         <w:br/>
@@ -650,26 +650,26 @@
           <w:rFonts w:ascii="Courier New" w:hAnsi="Courier New"/>
           <w:sz w:val="18"/>
         </w:rPr>
-        <w:t>CREATE TABLE sat_submission_lms (</w:t>
+        <w:t>CREATE TABLE sat_rental_item (</w:t>
         <w:br/>
-        <w:t xml:space="preserve"> submission_hk text REFERENCES link_submission,</w:t>
+        <w:t xml:space="preserve"> rental_item_hk text REFERENCES link_rental_item,</w:t>
         <w:br/>
         <w:t xml:space="preserve"> load_date timestamptz NOT NULL,</w:t>
         <w:br/>
         <w:t xml:space="preserve"> record_source text NOT NULL, hash_diff text NOT NULL,</w:t>
         <w:br/>
-        <w:t xml:space="preserve"> status text, grade integer, submitted_at timestamptz,</w:t>
+        <w:t xml:space="preserve"> status text, quantity integer, returned_at timestamptz,</w:t>
         <w:br/>
-        <w:t xml:space="preserve"> PRIMARY KEY(submission_hk,load_date)</w:t>
+        <w:t xml:space="preserve"> PRIMARY KEY(rental_item_hk,load_date)</w:t>
         <w:br/>
         <w:t>);</w:t>
       </w:r>
     </w:p>
     <w:p>
       <w:r>
-        <w:t>1. Исходные строки загружаются в stage_submission без ограничений целостности.</w:t>
+        <w:t>1. Исходные строки загружаются в stage_rental_item без ограничений целостности.</w:t>
         <w:br/>
-        <w:t>2. Запись с отсутствующим бизнес-ключом или метаданными сохраняется в rejected_submission.</w:t>
+        <w:t>2. Запись с отсутствующим бизнес-ключом или метаданными сохраняется в rejected_rental_item.</w:t>
         <w:br/>
         <w:t>3. Из корректных записей рассчитываются хеши.</w:t>
         <w:br/>
@@ -677,12 +677,12 @@
         <w:br/>
         <w:t>5. Описательный хеш сравнивается с последней версией родителя: новая строка добавляется только при изменении.</w:t>
         <w:br/>
-        <w:t>6. Представление mart_current_submission выбирает последние версии сателлитов.</w:t>
+        <w:t>6. Представление mart_current_rental_item выбирает последние версии сателлитов.</w:t>
       </w:r>
     </w:p>
     <w:p>
       <w:r>
-        <w:t>Порядок загрузки и ON CONFLICT DO NOTHING защищают от дубликатов при повторном запуске. Сырые описательные значения не агрегируются и не пересчитываются. Статус и время сдачи сохраняются как поступившие значения источника.</w:t>
+        <w:t>Порядок загрузки и ON CONFLICT DO NOTHING защищают от дубликатов при повторном запуске. Сырые описательные значения не агрегируются и не пересчитываются. Статус и время возврата сохраняются как поступившие значения источника.</w:t>
       </w:r>
     </w:p>
     <w:p>
@@ -761,7 +761,7 @@
                 <w:b w:val="0"/>
                 <w:sz w:val="20"/>
               </w:rPr>
-              <w:t>hub_student</w:t>
+              <w:t>hub_client</w:t>
             </w:r>
           </w:p>
         </w:tc>
@@ -797,7 +797,259 @@
                 <w:b w:val="0"/>
                 <w:sz w:val="20"/>
               </w:rPr>
-              <w:t>hub_course</w:t>
+              <w:t>hub_rental</w:t>
+            </w:r>
+          </w:p>
+        </w:tc>
+        <w:tc>
+          <w:tcPr>
+            <w:tcW w:type="dxa" w:w="4762"/>
+          </w:tcPr>
+          <w:p>
+            <w:pPr>
+              <w:spacing w:after="80"/>
+            </w:pPr>
+            <w:r>
+              <w:rPr>
+                <w:b w:val="0"/>
+                <w:sz w:val="20"/>
+              </w:rPr>
+              <w:t>3</w:t>
+            </w:r>
+          </w:p>
+        </w:tc>
+      </w:tr>
+      <w:tr>
+        <w:tc>
+          <w:tcPr>
+            <w:tcW w:type="dxa" w:w="4762"/>
+          </w:tcPr>
+          <w:p>
+            <w:pPr>
+              <w:spacing w:after="80"/>
+            </w:pPr>
+            <w:r>
+              <w:rPr>
+                <w:b w:val="0"/>
+                <w:sz w:val="20"/>
+              </w:rPr>
+              <w:t>hub_equipment</w:t>
+            </w:r>
+          </w:p>
+        </w:tc>
+        <w:tc>
+          <w:tcPr>
+            <w:tcW w:type="dxa" w:w="4762"/>
+          </w:tcPr>
+          <w:p>
+            <w:pPr>
+              <w:spacing w:after="80"/>
+            </w:pPr>
+            <w:r>
+              <w:rPr>
+                <w:b w:val="0"/>
+                <w:sz w:val="20"/>
+              </w:rPr>
+              <w:t>2</w:t>
+            </w:r>
+          </w:p>
+        </w:tc>
+      </w:tr>
+      <w:tr>
+        <w:tc>
+          <w:tcPr>
+            <w:tcW w:type="dxa" w:w="4762"/>
+          </w:tcPr>
+          <w:p>
+            <w:pPr>
+              <w:spacing w:after="80"/>
+            </w:pPr>
+            <w:r>
+              <w:rPr>
+                <w:b w:val="0"/>
+                <w:sz w:val="20"/>
+              </w:rPr>
+              <w:t>link_rental_item</w:t>
+            </w:r>
+          </w:p>
+        </w:tc>
+        <w:tc>
+          <w:tcPr>
+            <w:tcW w:type="dxa" w:w="4762"/>
+          </w:tcPr>
+          <w:p>
+            <w:pPr>
+              <w:spacing w:after="80"/>
+            </w:pPr>
+            <w:r>
+              <w:rPr>
+                <w:b w:val="0"/>
+                <w:sz w:val="20"/>
+              </w:rPr>
+              <w:t>4</w:t>
+            </w:r>
+          </w:p>
+        </w:tc>
+      </w:tr>
+      <w:tr>
+        <w:tc>
+          <w:tcPr>
+            <w:tcW w:type="dxa" w:w="4762"/>
+          </w:tcPr>
+          <w:p>
+            <w:pPr>
+              <w:spacing w:after="80"/>
+            </w:pPr>
+            <w:r>
+              <w:rPr>
+                <w:b w:val="0"/>
+                <w:sz w:val="20"/>
+              </w:rPr>
+              <w:t>sat_client</w:t>
+            </w:r>
+          </w:p>
+        </w:tc>
+        <w:tc>
+          <w:tcPr>
+            <w:tcW w:type="dxa" w:w="4762"/>
+          </w:tcPr>
+          <w:p>
+            <w:pPr>
+              <w:spacing w:after="80"/>
+            </w:pPr>
+            <w:r>
+              <w:rPr>
+                <w:b w:val="0"/>
+                <w:sz w:val="20"/>
+              </w:rPr>
+              <w:t>3</w:t>
+            </w:r>
+          </w:p>
+        </w:tc>
+      </w:tr>
+      <w:tr>
+        <w:tc>
+          <w:tcPr>
+            <w:tcW w:type="dxa" w:w="4762"/>
+          </w:tcPr>
+          <w:p>
+            <w:pPr>
+              <w:spacing w:after="80"/>
+            </w:pPr>
+            <w:r>
+              <w:rPr>
+                <w:b w:val="0"/>
+                <w:sz w:val="20"/>
+              </w:rPr>
+              <w:t>sat_rental</w:t>
+            </w:r>
+          </w:p>
+        </w:tc>
+        <w:tc>
+          <w:tcPr>
+            <w:tcW w:type="dxa" w:w="4762"/>
+          </w:tcPr>
+          <w:p>
+            <w:pPr>
+              <w:spacing w:after="80"/>
+            </w:pPr>
+            <w:r>
+              <w:rPr>
+                <w:b w:val="0"/>
+                <w:sz w:val="20"/>
+              </w:rPr>
+              <w:t>3</w:t>
+            </w:r>
+          </w:p>
+        </w:tc>
+      </w:tr>
+      <w:tr>
+        <w:tc>
+          <w:tcPr>
+            <w:tcW w:type="dxa" w:w="4762"/>
+          </w:tcPr>
+          <w:p>
+            <w:pPr>
+              <w:spacing w:after="80"/>
+            </w:pPr>
+            <w:r>
+              <w:rPr>
+                <w:b w:val="0"/>
+                <w:sz w:val="20"/>
+              </w:rPr>
+              <w:t>sat_equipment</w:t>
+            </w:r>
+          </w:p>
+        </w:tc>
+        <w:tc>
+          <w:tcPr>
+            <w:tcW w:type="dxa" w:w="4762"/>
+          </w:tcPr>
+          <w:p>
+            <w:pPr>
+              <w:spacing w:after="80"/>
+            </w:pPr>
+            <w:r>
+              <w:rPr>
+                <w:b w:val="0"/>
+                <w:sz w:val="20"/>
+              </w:rPr>
+              <w:t>2</w:t>
+            </w:r>
+          </w:p>
+        </w:tc>
+      </w:tr>
+      <w:tr>
+        <w:tc>
+          <w:tcPr>
+            <w:tcW w:type="dxa" w:w="4762"/>
+          </w:tcPr>
+          <w:p>
+            <w:pPr>
+              <w:spacing w:after="80"/>
+            </w:pPr>
+            <w:r>
+              <w:rPr>
+                <w:b w:val="0"/>
+                <w:sz w:val="20"/>
+              </w:rPr>
+              <w:t>sat_rental_item</w:t>
+            </w:r>
+          </w:p>
+        </w:tc>
+        <w:tc>
+          <w:tcPr>
+            <w:tcW w:type="dxa" w:w="4762"/>
+          </w:tcPr>
+          <w:p>
+            <w:pPr>
+              <w:spacing w:after="80"/>
+            </w:pPr>
+            <w:r>
+              <w:rPr>
+                <w:b w:val="0"/>
+                <w:sz w:val="20"/>
+              </w:rPr>
+              <w:t>6</w:t>
+            </w:r>
+          </w:p>
+        </w:tc>
+      </w:tr>
+      <w:tr>
+        <w:tc>
+          <w:tcPr>
+            <w:tcW w:type="dxa" w:w="4762"/>
+          </w:tcPr>
+          <w:p>
+            <w:pPr>
+              <w:spacing w:after="80"/>
+            </w:pPr>
+            <w:r>
+              <w:rPr>
+                <w:b w:val="0"/>
+                <w:sz w:val="20"/>
+              </w:rPr>
+              <w:t>rejected_rental_item</w:t>
             </w:r>
           </w:p>
         </w:tc>
@@ -833,259 +1085,7 @@
                 <w:b w:val="0"/>
                 <w:sz w:val="20"/>
               </w:rPr>
-              <w:t>hub_task</w:t>
-            </w:r>
-          </w:p>
-        </w:tc>
-        <w:tc>
-          <w:tcPr>
-            <w:tcW w:type="dxa" w:w="4762"/>
-          </w:tcPr>
-          <w:p>
-            <w:pPr>
-              <w:spacing w:after="80"/>
-            </w:pPr>
-            <w:r>
-              <w:rPr>
-                <w:b w:val="0"/>
-                <w:sz w:val="20"/>
-              </w:rPr>
-              <w:t>2</w:t>
-            </w:r>
-          </w:p>
-        </w:tc>
-      </w:tr>
-      <w:tr>
-        <w:tc>
-          <w:tcPr>
-            <w:tcW w:type="dxa" w:w="4762"/>
-          </w:tcPr>
-          <w:p>
-            <w:pPr>
-              <w:spacing w:after="80"/>
-            </w:pPr>
-            <w:r>
-              <w:rPr>
-                <w:b w:val="0"/>
-                <w:sz w:val="20"/>
-              </w:rPr>
-              <w:t>link_submission</w:t>
-            </w:r>
-          </w:p>
-        </w:tc>
-        <w:tc>
-          <w:tcPr>
-            <w:tcW w:type="dxa" w:w="4762"/>
-          </w:tcPr>
-          <w:p>
-            <w:pPr>
-              <w:spacing w:after="80"/>
-            </w:pPr>
-            <w:r>
-              <w:rPr>
-                <w:b w:val="0"/>
-                <w:sz w:val="20"/>
-              </w:rPr>
-              <w:t>4</w:t>
-            </w:r>
-          </w:p>
-        </w:tc>
-      </w:tr>
-      <w:tr>
-        <w:tc>
-          <w:tcPr>
-            <w:tcW w:type="dxa" w:w="4762"/>
-          </w:tcPr>
-          <w:p>
-            <w:pPr>
-              <w:spacing w:after="80"/>
-            </w:pPr>
-            <w:r>
-              <w:rPr>
-                <w:b w:val="0"/>
-                <w:sz w:val="20"/>
-              </w:rPr>
-              <w:t>sat_student_lms</w:t>
-            </w:r>
-          </w:p>
-        </w:tc>
-        <w:tc>
-          <w:tcPr>
-            <w:tcW w:type="dxa" w:w="4762"/>
-          </w:tcPr>
-          <w:p>
-            <w:pPr>
-              <w:spacing w:after="80"/>
-            </w:pPr>
-            <w:r>
-              <w:rPr>
-                <w:b w:val="0"/>
-                <w:sz w:val="20"/>
-              </w:rPr>
-              <w:t>3</w:t>
-            </w:r>
-          </w:p>
-        </w:tc>
-      </w:tr>
-      <w:tr>
-        <w:tc>
-          <w:tcPr>
-            <w:tcW w:type="dxa" w:w="4762"/>
-          </w:tcPr>
-          <w:p>
-            <w:pPr>
-              <w:spacing w:after="80"/>
-            </w:pPr>
-            <w:r>
-              <w:rPr>
-                <w:b w:val="0"/>
-                <w:sz w:val="20"/>
-              </w:rPr>
-              <w:t>sat_course_lms</w:t>
-            </w:r>
-          </w:p>
-        </w:tc>
-        <w:tc>
-          <w:tcPr>
-            <w:tcW w:type="dxa" w:w="4762"/>
-          </w:tcPr>
-          <w:p>
-            <w:pPr>
-              <w:spacing w:after="80"/>
-            </w:pPr>
-            <w:r>
-              <w:rPr>
-                <w:b w:val="0"/>
-                <w:sz w:val="20"/>
-              </w:rPr>
-              <w:t>1</w:t>
-            </w:r>
-          </w:p>
-        </w:tc>
-      </w:tr>
-      <w:tr>
-        <w:tc>
-          <w:tcPr>
-            <w:tcW w:type="dxa" w:w="4762"/>
-          </w:tcPr>
-          <w:p>
-            <w:pPr>
-              <w:spacing w:after="80"/>
-            </w:pPr>
-            <w:r>
-              <w:rPr>
-                <w:b w:val="0"/>
-                <w:sz w:val="20"/>
-              </w:rPr>
-              <w:t>sat_task_lms</w:t>
-            </w:r>
-          </w:p>
-        </w:tc>
-        <w:tc>
-          <w:tcPr>
-            <w:tcW w:type="dxa" w:w="4762"/>
-          </w:tcPr>
-          <w:p>
-            <w:pPr>
-              <w:spacing w:after="80"/>
-            </w:pPr>
-            <w:r>
-              <w:rPr>
-                <w:b w:val="0"/>
-                <w:sz w:val="20"/>
-              </w:rPr>
-              <w:t>2</w:t>
-            </w:r>
-          </w:p>
-        </w:tc>
-      </w:tr>
-      <w:tr>
-        <w:tc>
-          <w:tcPr>
-            <w:tcW w:type="dxa" w:w="4762"/>
-          </w:tcPr>
-          <w:p>
-            <w:pPr>
-              <w:spacing w:after="80"/>
-            </w:pPr>
-            <w:r>
-              <w:rPr>
-                <w:b w:val="0"/>
-                <w:sz w:val="20"/>
-              </w:rPr>
-              <w:t>sat_submission_lms</w:t>
-            </w:r>
-          </w:p>
-        </w:tc>
-        <w:tc>
-          <w:tcPr>
-            <w:tcW w:type="dxa" w:w="4762"/>
-          </w:tcPr>
-          <w:p>
-            <w:pPr>
-              <w:spacing w:after="80"/>
-            </w:pPr>
-            <w:r>
-              <w:rPr>
-                <w:b w:val="0"/>
-                <w:sz w:val="20"/>
-              </w:rPr>
-              <w:t>6</w:t>
-            </w:r>
-          </w:p>
-        </w:tc>
-      </w:tr>
-      <w:tr>
-        <w:tc>
-          <w:tcPr>
-            <w:tcW w:type="dxa" w:w="4762"/>
-          </w:tcPr>
-          <w:p>
-            <w:pPr>
-              <w:spacing w:after="80"/>
-            </w:pPr>
-            <w:r>
-              <w:rPr>
-                <w:b w:val="0"/>
-                <w:sz w:val="20"/>
-              </w:rPr>
-              <w:t>rejected_submission</w:t>
-            </w:r>
-          </w:p>
-        </w:tc>
-        <w:tc>
-          <w:tcPr>
-            <w:tcW w:type="dxa" w:w="4762"/>
-          </w:tcPr>
-          <w:p>
-            <w:pPr>
-              <w:spacing w:after="80"/>
-            </w:pPr>
-            <w:r>
-              <w:rPr>
-                <w:b w:val="0"/>
-                <w:sz w:val="20"/>
-              </w:rPr>
-              <w:t>1</w:t>
-            </w:r>
-          </w:p>
-        </w:tc>
-      </w:tr>
-      <w:tr>
-        <w:tc>
-          <w:tcPr>
-            <w:tcW w:type="dxa" w:w="4762"/>
-          </w:tcPr>
-          <w:p>
-            <w:pPr>
-              <w:spacing w:after="80"/>
-            </w:pPr>
-            <w:r>
-              <w:rPr>
-                <w:b w:val="0"/>
-                <w:sz w:val="20"/>
-              </w:rPr>
-              <w:t>mart_current_submission</w:t>
+              <w:t>mart_current_rental_item</w:t>
             </w:r>
           </w:p>
         </w:tc>
@@ -1110,7 +1110,7 @@
     </w:tbl>
     <w:p>
       <w:r>
-        <w:t>История сдачи ST-001 / DB / DB-PR01 содержит три версии. Переход к прежнему состоянию сохранён как отдельное событие загрузки.</w:t>
+        <w:t>История позиции CL-001 / RENT-001 / NAD-SN-101 содержит три версии. Переход к прежнему состоянию сохранён как отдельное событие загрузки.</w:t>
       </w:r>
     </w:p>
     <w:tbl>
@@ -1175,7 +1175,7 @@
                 <w:b/>
                 <w:sz w:val="20"/>
               </w:rPr>
-              <w:t>Оценка</w:t>
+              <w:t>Количество</w:t>
             </w:r>
           </w:p>
         </w:tc>
@@ -1211,7 +1211,7 @@
                 <w:b w:val="0"/>
                 <w:sz w:val="20"/>
               </w:rPr>
-              <w:t>submitted</w:t>
+              <w:t>issued</w:t>
             </w:r>
           </w:p>
         </w:tc>
@@ -1228,7 +1228,7 @@
                 <w:b w:val="0"/>
                 <w:sz w:val="20"/>
               </w:rPr>
-              <w:t>NULL</w:t>
+              <w:t>1</w:t>
             </w:r>
           </w:p>
         </w:tc>
@@ -1264,7 +1264,7 @@
                 <w:b w:val="0"/>
                 <w:sz w:val="20"/>
               </w:rPr>
-              <w:t>graded</w:t>
+              <w:t>returned</w:t>
             </w:r>
           </w:p>
         </w:tc>
@@ -1281,7 +1281,7 @@
                 <w:b w:val="0"/>
                 <w:sz w:val="20"/>
               </w:rPr>
-              <w:t>4</w:t>
+              <w:t>1</w:t>
             </w:r>
           </w:p>
         </w:tc>
@@ -1317,7 +1317,7 @@
                 <w:b w:val="0"/>
                 <w:sz w:val="20"/>
               </w:rPr>
-              <w:t>submitted</w:t>
+              <w:t>issued</w:t>
             </w:r>
           </w:p>
         </w:tc>
@@ -1334,7 +1334,7 @@
                 <w:b w:val="0"/>
                 <w:sz w:val="20"/>
               </w:rPr>
-              <w:t>NULL</w:t>
+              <w:t>1</w:t>
             </w:r>
           </w:p>
         </w:tc>
@@ -1350,7 +1350,7 @@
     </w:p>
     <w:p>
       <w:r>
-        <w:t>Успешно выполнены проверки количества строк, внешних ключей, текущей версии и отсутствия дубликатов при повторной загрузке B1, B2 и B3. Все SQL-утверждения завершились без ошибок; получено ALL DATA VAULT CHECKS PASSED. Проверочный файл выполнен повторно целиком. SHA256 бизнес-ключа ST-001 совпал с независимым расчётом Python.</w:t>
+        <w:t>Успешно выполнены проверки количества строк, внешних ключей, текущей версии и отсутствия дубликатов при повторной загрузке B1, B2 и B3. Все SQL-утверждения завершились без ошибок; получено ALL DATA VAULT CHECKS PASSED. Проверочный файл выполнен повторно целиком. SHA256 бизнес-ключа CL-001 совпал с независимым расчётом Python.</w:t>
       </w:r>
     </w:p>
     <w:p>
@@ -1381,10 +1381,243 @@
         <w:t>Код и фактический протокол: https://github.com/vasiliyvasilek20/data-warehouse-labs-223-322</w:t>
       </w:r>
     </w:p>
+    <w:p>
+      <w:pPr>
+        <w:sectPr>
+          <w:footerReference w:type="default" r:id="rId9"/>
+          <w:pgSz w:w="11906" w:h="16838"/>
+          <w:pgMar w:top="1134" w:right="1134" w:bottom="1134" w:left="1247" w:header="720" w:footer="720" w:gutter="0"/>
+          <w:cols w:space="720"/>
+          <w:docGrid w:linePitch="360"/>
+        </w:sectPr>
+      </w:pPr>
+    </w:p>
+    <w:p>
+      <w:pPr>
+        <w:pStyle w:val="Heading1"/>
+      </w:pPr>
+      <w:r>
+        <w:t>Скриншоты выполнения 1</w:t>
+      </w:r>
+    </w:p>
+    <w:p>
+      <w:r>
+        <w:t>Таблицы хранилища Data Vault</w:t>
+      </w:r>
+    </w:p>
+    <w:p>
+      <w:pPr>
+        <w:spacing w:after="0" w:line="240" w:lineRule="auto"/>
+      </w:pPr>
+      <w:r>
+        <w:drawing>
+          <wp:inline xmlns:a="http://schemas.openxmlformats.org/drawingml/2006/main" xmlns:pic="http://schemas.openxmlformats.org/drawingml/2006/picture">
+            <wp:extent cx="9180000" cy="5163750"/>
+            <wp:docPr id="2" name="Picture 2"/>
+            <wp:cNvGraphicFramePr>
+              <a:graphicFrameLocks noChangeAspect="1"/>
+            </wp:cNvGraphicFramePr>
+            <a:graphic>
+              <a:graphicData uri="http://schemas.openxmlformats.org/drawingml/2006/picture">
+                <pic:pic>
+                  <pic:nvPicPr>
+                    <pic:cNvPr id="0" name="01_tables.jpg"/>
+                    <pic:cNvPicPr/>
+                  </pic:nvPicPr>
+                  <pic:blipFill>
+                    <a:blip r:embed="rId11"/>
+                    <a:stretch>
+                      <a:fillRect/>
+                    </a:stretch>
+                  </pic:blipFill>
+                  <pic:spPr>
+                    <a:xfrm>
+                      <a:off x="0" y="0"/>
+                      <a:ext cx="9180000" cy="5163750"/>
+                    </a:xfrm>
+                    <a:prstGeom prst="rect"/>
+                  </pic:spPr>
+                </pic:pic>
+              </a:graphicData>
+            </a:graphic>
+          </wp:inline>
+        </w:drawing>
+      </w:r>
+    </w:p>
+    <w:p>
+      <w:r>
+        <w:br w:type="page"/>
+      </w:r>
+    </w:p>
+    <w:p>
+      <w:pPr>
+        <w:pStyle w:val="Heading1"/>
+      </w:pPr>
+      <w:r>
+        <w:t>Скриншоты выполнения 2</w:t>
+      </w:r>
+    </w:p>
+    <w:p>
+      <w:r>
+        <w:t>Текущая витрина проката</w:t>
+      </w:r>
+    </w:p>
+    <w:p>
+      <w:pPr>
+        <w:spacing w:after="0" w:line="240" w:lineRule="auto"/>
+      </w:pPr>
+      <w:r>
+        <w:drawing>
+          <wp:inline xmlns:a="http://schemas.openxmlformats.org/drawingml/2006/main" xmlns:pic="http://schemas.openxmlformats.org/drawingml/2006/picture">
+            <wp:extent cx="9180000" cy="5163750"/>
+            <wp:docPr id="3" name="Picture 3"/>
+            <wp:cNvGraphicFramePr>
+              <a:graphicFrameLocks noChangeAspect="1"/>
+            </wp:cNvGraphicFramePr>
+            <a:graphic>
+              <a:graphicData uri="http://schemas.openxmlformats.org/drawingml/2006/picture">
+                <pic:pic>
+                  <pic:nvPicPr>
+                    <pic:cNvPr id="0" name="02_current_data.jpg"/>
+                    <pic:cNvPicPr/>
+                  </pic:nvPicPr>
+                  <pic:blipFill>
+                    <a:blip r:embed="rId12"/>
+                    <a:stretch>
+                      <a:fillRect/>
+                    </a:stretch>
+                  </pic:blipFill>
+                  <pic:spPr>
+                    <a:xfrm>
+                      <a:off x="0" y="0"/>
+                      <a:ext cx="9180000" cy="5163750"/>
+                    </a:xfrm>
+                    <a:prstGeom prst="rect"/>
+                  </pic:spPr>
+                </pic:pic>
+              </a:graphicData>
+            </a:graphic>
+          </wp:inline>
+        </w:drawing>
+      </w:r>
+    </w:p>
+    <w:p>
+      <w:r>
+        <w:br w:type="page"/>
+      </w:r>
+    </w:p>
+    <w:p>
+      <w:pPr>
+        <w:pStyle w:val="Heading1"/>
+      </w:pPr>
+      <w:r>
+        <w:t>Скриншоты выполнения 3</w:t>
+      </w:r>
+    </w:p>
+    <w:p>
+      <w:r>
+        <w:t>История позиции: issued → returned → issued</w:t>
+      </w:r>
+    </w:p>
+    <w:p>
+      <w:pPr>
+        <w:spacing w:after="0" w:line="240" w:lineRule="auto"/>
+      </w:pPr>
+      <w:r>
+        <w:drawing>
+          <wp:inline xmlns:a="http://schemas.openxmlformats.org/drawingml/2006/main" xmlns:pic="http://schemas.openxmlformats.org/drawingml/2006/picture">
+            <wp:extent cx="9180000" cy="5163750"/>
+            <wp:docPr id="4" name="Picture 4"/>
+            <wp:cNvGraphicFramePr>
+              <a:graphicFrameLocks noChangeAspect="1"/>
+            </wp:cNvGraphicFramePr>
+            <a:graphic>
+              <a:graphicData uri="http://schemas.openxmlformats.org/drawingml/2006/picture">
+                <pic:pic>
+                  <pic:nvPicPr>
+                    <pic:cNvPr id="0" name="03_history.jpg"/>
+                    <pic:cNvPicPr/>
+                  </pic:nvPicPr>
+                  <pic:blipFill>
+                    <a:blip r:embed="rId13"/>
+                    <a:stretch>
+                      <a:fillRect/>
+                    </a:stretch>
+                  </pic:blipFill>
+                  <pic:spPr>
+                    <a:xfrm>
+                      <a:off x="0" y="0"/>
+                      <a:ext cx="9180000" cy="5163750"/>
+                    </a:xfrm>
+                    <a:prstGeom prst="rect"/>
+                  </pic:spPr>
+                </pic:pic>
+              </a:graphicData>
+            </a:graphic>
+          </wp:inline>
+        </w:drawing>
+      </w:r>
+    </w:p>
+    <w:p>
+      <w:r>
+        <w:br w:type="page"/>
+      </w:r>
+    </w:p>
+    <w:p>
+      <w:pPr>
+        <w:pStyle w:val="Heading1"/>
+      </w:pPr>
+      <w:r>
+        <w:t>Скриншоты выполнения 4</w:t>
+      </w:r>
+    </w:p>
+    <w:p>
+      <w:r>
+        <w:t>Повторная загрузка и контрольные количества</w:t>
+      </w:r>
+    </w:p>
+    <w:p>
+      <w:pPr>
+        <w:spacing w:after="0" w:line="240" w:lineRule="auto"/>
+      </w:pPr>
+      <w:r>
+        <w:drawing>
+          <wp:inline xmlns:a="http://schemas.openxmlformats.org/drawingml/2006/main" xmlns:pic="http://schemas.openxmlformats.org/drawingml/2006/picture">
+            <wp:extent cx="9180000" cy="5163750"/>
+            <wp:docPr id="5" name="Picture 5"/>
+            <wp:cNvGraphicFramePr>
+              <a:graphicFrameLocks noChangeAspect="1"/>
+            </wp:cNvGraphicFramePr>
+            <a:graphic>
+              <a:graphicData uri="http://schemas.openxmlformats.org/drawingml/2006/picture">
+                <pic:pic>
+                  <pic:nvPicPr>
+                    <pic:cNvPr id="0" name="04_repeat_and_counts.jpg"/>
+                    <pic:cNvPicPr/>
+                  </pic:nvPicPr>
+                  <pic:blipFill>
+                    <a:blip r:embed="rId14"/>
+                    <a:stretch>
+                      <a:fillRect/>
+                    </a:stretch>
+                  </pic:blipFill>
+                  <pic:spPr>
+                    <a:xfrm>
+                      <a:off x="0" y="0"/>
+                      <a:ext cx="9180000" cy="5163750"/>
+                    </a:xfrm>
+                    <a:prstGeom prst="rect"/>
+                  </pic:spPr>
+                </pic:pic>
+              </a:graphicData>
+            </a:graphic>
+          </wp:inline>
+        </w:drawing>
+      </w:r>
+    </w:p>
     <w:sectPr>
-      <w:footerReference w:type="default" r:id="rId9"/>
-      <w:pgSz w:w="11906" w:h="16838"/>
-      <w:pgMar w:top="1134" w:right="1134" w:bottom="1134" w:left="1247" w:header="720" w:footer="720" w:gutter="0"/>
+      <w:pgSz w:w="16838" w:h="11906" w:orient="landscape"/>
+      <w:pgMar w:top="794" w:right="907" w:bottom="794" w:left="907" w:header="720" w:footer="720" w:gutter="0"/>
       <w:cols w:space="720"/>
       <w:docGrid w:linePitch="360"/>
     </w:sectPr>
@@ -1791,6 +2024,7 @@
       </w:tabs>
       <w:spacing w:after="0" w:line="240" w:lineRule="auto"/>
     </w:pPr>
+    <w:rPr/>
   </w:style>
   <w:style w:type="character" w:customStyle="1" w:styleId="HeaderChar">
     <w:name w:val="Header Char"/>
@@ -1813,6 +2047,7 @@
       </w:tabs>
       <w:spacing w:after="0" w:line="240" w:lineRule="auto"/>
     </w:pPr>
+    <w:rPr/>
   </w:style>
   <w:style w:type="character" w:customStyle="1" w:styleId="FooterChar">
     <w:name w:val="Footer Char"/>
@@ -1836,7 +2071,7 @@
       <w:outlineLvl w:val="0"/>
     </w:pPr>
     <w:rPr>
-      <w:rFonts w:asciiTheme="majorHAnsi" w:eastAsiaTheme="majorEastAsia" w:hAnsiTheme="majorHAnsi" w:cstheme="majorBidi" w:ascii="Times New Roman" w:hAnsi="Times New Roman"/>
+      <w:rFonts w:cstheme="majorBidi" w:ascii="Times New Roman" w:hAnsi="Times New Roman"/>
       <w:b/>
       <w:bCs/>
       <w:color w:val="000000"/>
@@ -1860,7 +2095,7 @@
       <w:outlineLvl w:val="1"/>
     </w:pPr>
     <w:rPr>
-      <w:rFonts w:asciiTheme="majorHAnsi" w:eastAsiaTheme="majorEastAsia" w:hAnsiTheme="majorHAnsi" w:cstheme="majorBidi" w:ascii="Times New Roman" w:hAnsi="Times New Roman"/>
+      <w:rFonts w:cstheme="majorBidi" w:ascii="Times New Roman" w:hAnsi="Times New Roman"/>
       <w:b/>
       <w:bCs/>
       <w:color w:val="000000"/>
@@ -1884,7 +2119,7 @@
       <w:outlineLvl w:val="2"/>
     </w:pPr>
     <w:rPr>
-      <w:rFonts w:asciiTheme="majorHAnsi" w:eastAsiaTheme="majorEastAsia" w:hAnsiTheme="majorHAnsi" w:cstheme="majorBidi"/>
+      <w:rFonts w:cstheme="majorBidi"/>
       <w:b/>
       <w:bCs/>
       <w:color w:val="4F81BD" w:themeColor="accent1"/>
@@ -1907,7 +2142,7 @@
       <w:outlineLvl w:val="3"/>
     </w:pPr>
     <w:rPr>
-      <w:rFonts w:asciiTheme="majorHAnsi" w:eastAsiaTheme="majorEastAsia" w:hAnsiTheme="majorHAnsi" w:cstheme="majorBidi"/>
+      <w:rFonts w:cstheme="majorBidi"/>
       <w:b/>
       <w:bCs/>
       <w:i/>
@@ -1932,7 +2167,7 @@
       <w:outlineLvl w:val="4"/>
     </w:pPr>
     <w:rPr>
-      <w:rFonts w:asciiTheme="majorHAnsi" w:eastAsiaTheme="majorEastAsia" w:hAnsiTheme="majorHAnsi" w:cstheme="majorBidi"/>
+      <w:rFonts w:cstheme="majorBidi"/>
       <w:color w:val="243F60" w:themeColor="accent1" w:themeShade="7F"/>
     </w:rPr>
   </w:style>
@@ -1953,7 +2188,7 @@
       <w:outlineLvl w:val="5"/>
     </w:pPr>
     <w:rPr>
-      <w:rFonts w:asciiTheme="majorHAnsi" w:eastAsiaTheme="majorEastAsia" w:hAnsiTheme="majorHAnsi" w:cstheme="majorBidi"/>
+      <w:rFonts w:cstheme="majorBidi"/>
       <w:i/>
       <w:iCs/>
       <w:color w:val="243F60" w:themeColor="accent1" w:themeShade="7F"/>
@@ -1976,7 +2211,7 @@
       <w:outlineLvl w:val="6"/>
     </w:pPr>
     <w:rPr>
-      <w:rFonts w:asciiTheme="majorHAnsi" w:eastAsiaTheme="majorEastAsia" w:hAnsiTheme="majorHAnsi" w:cstheme="majorBidi"/>
+      <w:rFonts w:cstheme="majorBidi"/>
       <w:i/>
       <w:iCs/>
       <w:color w:val="404040" w:themeColor="text1" w:themeTint="BF"/>
@@ -1999,7 +2234,7 @@
       <w:outlineLvl w:val="7"/>
     </w:pPr>
     <w:rPr>
-      <w:rFonts w:asciiTheme="majorHAnsi" w:eastAsiaTheme="majorEastAsia" w:hAnsiTheme="majorHAnsi" w:cstheme="majorBidi"/>
+      <w:rFonts w:cstheme="majorBidi"/>
       <w:color w:val="4F81BD" w:themeColor="accent1"/>
       <w:sz w:val="20"/>
       <w:szCs w:val="20"/>
@@ -2022,7 +2257,7 @@
       <w:outlineLvl w:val="8"/>
     </w:pPr>
     <w:rPr>
-      <w:rFonts w:asciiTheme="majorHAnsi" w:eastAsiaTheme="majorEastAsia" w:hAnsiTheme="majorHAnsi" w:cstheme="majorBidi"/>
+      <w:rFonts w:cstheme="majorBidi"/>
       <w:i/>
       <w:iCs/>
       <w:color w:val="404040" w:themeColor="text1" w:themeTint="BF"/>
@@ -2065,6 +2300,7 @@
     <w:pPr>
       <w:spacing w:after="0" w:line="240" w:lineRule="auto"/>
     </w:pPr>
+    <w:rPr/>
   </w:style>
   <w:style w:type="character" w:customStyle="1" w:styleId="Heading1Char">
     <w:name w:val="Heading 1 Char"/>
@@ -2118,14 +2354,11 @@
     <w:qFormat/>
     <w:rsid w:val="00FC693F"/>
     <w:pPr>
-      <w:pBdr>
-        <w:bottom w:val="single" w:sz="8" w:space="4" w:color="4F81BD" w:themeColor="accent1"/>
-      </w:pBdr>
       <w:spacing w:after="140" w:line="259" w:lineRule="auto"/>
       <w:contextualSpacing/>
     </w:pPr>
     <w:rPr>
-      <w:rFonts w:asciiTheme="majorHAnsi" w:eastAsiaTheme="majorEastAsia" w:hAnsiTheme="majorHAnsi" w:cstheme="majorBidi" w:ascii="Times New Roman" w:hAnsi="Times New Roman"/>
+      <w:rFonts w:cstheme="majorBidi" w:ascii="Times New Roman" w:hAnsi="Times New Roman"/>
       <w:color w:val="000000"/>
       <w:spacing w:val="5"/>
       <w:kern w:val="28"/>
@@ -2162,7 +2395,7 @@
       </w:numPr>
     </w:pPr>
     <w:rPr>
-      <w:rFonts w:asciiTheme="majorHAnsi" w:eastAsiaTheme="majorEastAsia" w:hAnsiTheme="majorHAnsi" w:cstheme="majorBidi"/>
+      <w:rFonts w:cstheme="majorBidi"/>
       <w:i/>
       <w:iCs/>
       <w:color w:val="4F81BD" w:themeColor="accent1"/>
@@ -2197,6 +2430,7 @@
       <w:ind w:left="720"/>
       <w:contextualSpacing/>
     </w:pPr>
+    <w:rPr/>
   </w:style>
   <w:style w:type="paragraph" w:styleId="BodyText">
     <w:name w:val="Body Text"/>
@@ -2208,6 +2442,7 @@
     <w:pPr>
       <w:spacing w:after="120"/>
     </w:pPr>
+    <w:rPr/>
   </w:style>
   <w:style w:type="character" w:customStyle="1" w:styleId="BodyTextChar">
     <w:name w:val="Body Text Char"/>
@@ -2226,6 +2461,7 @@
     <w:pPr>
       <w:spacing w:after="120" w:line="480" w:lineRule="auto"/>
     </w:pPr>
+    <w:rPr/>
   </w:style>
   <w:style w:type="character" w:customStyle="1" w:styleId="BodyText2Char">
     <w:name w:val="Body Text 2 Char"/>
@@ -2270,6 +2506,7 @@
       <w:ind w:left="360" w:hanging="360"/>
       <w:contextualSpacing/>
     </w:pPr>
+    <w:rPr/>
   </w:style>
   <w:style w:type="paragraph" w:styleId="List2">
     <w:name w:val="List 2"/>
@@ -2281,6 +2518,7 @@
       <w:ind w:left="720" w:hanging="360"/>
       <w:contextualSpacing/>
     </w:pPr>
+    <w:rPr/>
   </w:style>
   <w:style w:type="paragraph" w:styleId="List3">
     <w:name w:val="List 3"/>
@@ -2292,6 +2530,7 @@
       <w:ind w:left="1080" w:hanging="360"/>
       <w:contextualSpacing/>
     </w:pPr>
+    <w:rPr/>
   </w:style>
   <w:style w:type="paragraph" w:styleId="ListBullet">
     <w:name w:val="List Bullet"/>
@@ -2305,6 +2544,7 @@
       </w:numPr>
       <w:contextualSpacing/>
     </w:pPr>
+    <w:rPr/>
   </w:style>
   <w:style w:type="paragraph" w:styleId="ListBullet2">
     <w:name w:val="List Bullet 2"/>
@@ -2318,6 +2558,7 @@
       </w:numPr>
       <w:contextualSpacing/>
     </w:pPr>
+    <w:rPr/>
   </w:style>
   <w:style w:type="paragraph" w:styleId="ListBullet3">
     <w:name w:val="List Bullet 3"/>
@@ -2331,6 +2572,7 @@
       </w:numPr>
       <w:contextualSpacing/>
     </w:pPr>
+    <w:rPr/>
   </w:style>
   <w:style w:type="paragraph" w:styleId="ListNumber">
     <w:name w:val="List Number"/>
@@ -2344,6 +2586,7 @@
       </w:numPr>
       <w:contextualSpacing/>
     </w:pPr>
+    <w:rPr/>
   </w:style>
   <w:style w:type="paragraph" w:styleId="ListNumber2">
     <w:name w:val="List Number 2"/>
@@ -2357,6 +2600,7 @@
       </w:numPr>
       <w:contextualSpacing/>
     </w:pPr>
+    <w:rPr/>
   </w:style>
   <w:style w:type="paragraph" w:styleId="ListNumber3">
     <w:name w:val="List Number 3"/>
@@ -2370,6 +2614,7 @@
       </w:numPr>
       <w:contextualSpacing/>
     </w:pPr>
+    <w:rPr/>
   </w:style>
   <w:style w:type="paragraph" w:styleId="ListContinue">
     <w:name w:val="List Continue"/>
@@ -2382,6 +2627,7 @@
       <w:ind w:left="360"/>
       <w:contextualSpacing/>
     </w:pPr>
+    <w:rPr/>
   </w:style>
   <w:style w:type="paragraph" w:styleId="ListContinue2">
     <w:name w:val="List Continue 2"/>
@@ -2394,6 +2640,7 @@
       <w:ind w:left="720"/>
       <w:contextualSpacing/>
     </w:pPr>
+    <w:rPr/>
   </w:style>
   <w:style w:type="paragraph" w:styleId="ListContinue3">
     <w:name w:val="List Continue 3"/>
@@ -2406,6 +2653,7 @@
       <w:ind w:left="1080"/>
       <w:contextualSpacing/>
     </w:pPr>
+    <w:rPr/>
   </w:style>
   <w:style w:type="paragraph" w:styleId="MacroText">
     <w:name w:val="macro"/>
@@ -2605,9 +2853,6 @@
     <w:qFormat/>
     <w:rsid w:val="00FC693F"/>
     <w:pPr>
-      <w:pBdr>
-        <w:bottom w:val="single" w:sz="4" w:space="4" w:color="4F81BD" w:themeColor="accent1"/>
-      </w:pBdr>
       <w:spacing w:before="200" w:after="280"/>
       <w:ind w:left="936" w:right="936"/>
     </w:pPr>
@@ -2711,6 +2956,7 @@
     <w:pPr>
       <w:outlineLvl w:val="9"/>
     </w:pPr>
+    <w:rPr/>
   </w:style>
   <w:style w:type="table" w:styleId="TableGrid">
     <w:name w:val="Table Grid"/>

</xml_diff>